<commit_message>
First test bench code ready
basic functionality test ready.
</commit_message>
<xml_diff>
--- a/Quantitative Evaluation of LoRa RF Resiliency.docx
+++ b/Quantitative Evaluation of LoRa RF Resiliency.docx
@@ -983,21 +983,22 @@
     <w:tbl>
       <w:tblPr>
         <w:tblStyle w:val="TableGrid"/>
-        <w:tblW w:w="0" w:type="auto"/>
+        <w:tblW w:w="9459" w:type="dxa"/>
         <w:tblLook w:val="04A0" w:firstRow="1" w:lastRow="0" w:firstColumn="1" w:lastColumn="0" w:noHBand="0" w:noVBand="1"/>
       </w:tblPr>
       <w:tblGrid>
-        <w:gridCol w:w="1558"/>
-        <w:gridCol w:w="1558"/>
-        <w:gridCol w:w="1558"/>
-        <w:gridCol w:w="1558"/>
-        <w:gridCol w:w="1559"/>
-        <w:gridCol w:w="1559"/>
+        <w:gridCol w:w="764"/>
+        <w:gridCol w:w="1036"/>
+        <w:gridCol w:w="1229"/>
+        <w:gridCol w:w="1826"/>
+        <w:gridCol w:w="1530"/>
+        <w:gridCol w:w="1705"/>
+        <w:gridCol w:w="1369"/>
       </w:tblGrid>
       <w:tr>
         <w:tc>
           <w:tcPr>
-            <w:tcW w:w="1558" w:type="dxa"/>
+            <w:tcW w:w="764" w:type="dxa"/>
           </w:tcPr>
           <w:p>
             <w:r>
@@ -1007,7 +1008,7 @@
         </w:tc>
         <w:tc>
           <w:tcPr>
-            <w:tcW w:w="1558" w:type="dxa"/>
+            <w:tcW w:w="1036" w:type="dxa"/>
           </w:tcPr>
           <w:p>
             <w:r>
@@ -1017,7 +1018,7 @@
         </w:tc>
         <w:tc>
           <w:tcPr>
-            <w:tcW w:w="1558" w:type="dxa"/>
+            <w:tcW w:w="1229" w:type="dxa"/>
           </w:tcPr>
           <w:p>
             <w:r>
@@ -1027,61 +1028,123 @@
         </w:tc>
         <w:tc>
           <w:tcPr>
-            <w:tcW w:w="1558" w:type="dxa"/>
-          </w:tcPr>
-          <w:p>
-            <w:r>
-              <w:t>DR</w:t>
-            </w:r>
-          </w:p>
-        </w:tc>
-        <w:tc>
-          <w:tcPr>
-            <w:tcW w:w="1559" w:type="dxa"/>
-          </w:tcPr>
-          <w:p/>
-        </w:tc>
-        <w:tc>
-          <w:tcPr>
-            <w:tcW w:w="1559" w:type="dxa"/>
-          </w:tcPr>
-          <w:p/>
+            <w:tcW w:w="1826" w:type="dxa"/>
+          </w:tcPr>
+          <w:p>
+            <w:r>
+              <w:t>Tx Power</w:t>
+            </w:r>
+          </w:p>
+        </w:tc>
+        <w:tc>
+          <w:tcPr>
+            <w:tcW w:w="1530" w:type="dxa"/>
+          </w:tcPr>
+          <w:p>
+            <w:r>
+              <w:t>Thermal noise estimate</w:t>
+            </w:r>
+          </w:p>
+        </w:tc>
+        <w:tc>
+          <w:tcPr>
+            <w:tcW w:w="1705" w:type="dxa"/>
+          </w:tcPr>
+          <w:p>
+            <w:r>
+              <w:t>SX1262 Rx sensitivity (spec-</w:t>
+            </w:r>
+            <w:proofErr w:type="spellStart"/>
+            <w:r>
+              <w:t>typ</w:t>
+            </w:r>
+            <w:proofErr w:type="spellEnd"/>
+            <w:r>
+              <w:t>)</w:t>
+            </w:r>
+          </w:p>
+        </w:tc>
+        <w:tc>
+          <w:tcPr>
+            <w:tcW w:w="1369" w:type="dxa"/>
+          </w:tcPr>
+          <w:p>
+            <w:r>
+              <w:t>DR (theoretical</w:t>
+            </w:r>
+            <w:r>
+              <w:t>, CR = 4/5, preamble on</w:t>
+            </w:r>
+            <w:r>
+              <w:t>)</w:t>
+            </w:r>
+          </w:p>
         </w:tc>
       </w:tr>
       <w:tr>
         <w:tc>
           <w:tcPr>
-            <w:tcW w:w="1558" w:type="dxa"/>
-          </w:tcPr>
-          <w:p/>
-        </w:tc>
-        <w:tc>
-          <w:tcPr>
-            <w:tcW w:w="1558" w:type="dxa"/>
-          </w:tcPr>
-          <w:p/>
-        </w:tc>
-        <w:tc>
-          <w:tcPr>
-            <w:tcW w:w="1558" w:type="dxa"/>
-          </w:tcPr>
-          <w:p/>
-        </w:tc>
-        <w:tc>
-          <w:tcPr>
-            <w:tcW w:w="1558" w:type="dxa"/>
-          </w:tcPr>
-          <w:p/>
-        </w:tc>
-        <w:tc>
-          <w:tcPr>
-            <w:tcW w:w="1559" w:type="dxa"/>
-          </w:tcPr>
-          <w:p/>
-        </w:tc>
-        <w:tc>
-          <w:tcPr>
-            <w:tcW w:w="1559" w:type="dxa"/>
+            <w:tcW w:w="764" w:type="dxa"/>
+          </w:tcPr>
+          <w:p>
+            <w:r>
+              <w:t>7</w:t>
+            </w:r>
+          </w:p>
+        </w:tc>
+        <w:tc>
+          <w:tcPr>
+            <w:tcW w:w="1036" w:type="dxa"/>
+          </w:tcPr>
+          <w:p>
+            <w:r>
+              <w:t>10.4kHz</w:t>
+            </w:r>
+          </w:p>
+        </w:tc>
+        <w:tc>
+          <w:tcPr>
+            <w:tcW w:w="1229" w:type="dxa"/>
+          </w:tcPr>
+          <w:p>
+            <w:r>
+              <w:t>951MHz</w:t>
+            </w:r>
+          </w:p>
+        </w:tc>
+        <w:tc>
+          <w:tcPr>
+            <w:tcW w:w="1826" w:type="dxa"/>
+          </w:tcPr>
+          <w:p>
+            <w:r>
+              <w:t>22dBm -</w:t>
+            </w:r>
+          </w:p>
+        </w:tc>
+        <w:tc>
+          <w:tcPr>
+            <w:tcW w:w="1530" w:type="dxa"/>
+          </w:tcPr>
+          <w:p>
+            <w:r>
+              <w:t>-133.6 dBm</w:t>
+            </w:r>
+          </w:p>
+        </w:tc>
+        <w:tc>
+          <w:tcPr>
+            <w:tcW w:w="1705" w:type="dxa"/>
+          </w:tcPr>
+          <w:p>
+            <w:r>
+              <w:t>-134 dBm</w:t>
+            </w:r>
+          </w:p>
+        </w:tc>
+        <w:tc>
+          <w:tcPr>
+            <w:tcW w:w="1369" w:type="dxa"/>
           </w:tcPr>
           <w:p/>
         </w:tc>
@@ -1089,37 +1152,73 @@
       <w:tr>
         <w:tc>
           <w:tcPr>
-            <w:tcW w:w="1558" w:type="dxa"/>
-          </w:tcPr>
-          <w:p/>
-        </w:tc>
-        <w:tc>
-          <w:tcPr>
-            <w:tcW w:w="1558" w:type="dxa"/>
-          </w:tcPr>
-          <w:p/>
-        </w:tc>
-        <w:tc>
-          <w:tcPr>
-            <w:tcW w:w="1558" w:type="dxa"/>
-          </w:tcPr>
-          <w:p/>
-        </w:tc>
-        <w:tc>
-          <w:tcPr>
-            <w:tcW w:w="1558" w:type="dxa"/>
-          </w:tcPr>
-          <w:p/>
-        </w:tc>
-        <w:tc>
-          <w:tcPr>
-            <w:tcW w:w="1559" w:type="dxa"/>
-          </w:tcPr>
-          <w:p/>
-        </w:tc>
-        <w:tc>
-          <w:tcPr>
-            <w:tcW w:w="1559" w:type="dxa"/>
+            <w:tcW w:w="764" w:type="dxa"/>
+          </w:tcPr>
+          <w:p>
+            <w:r>
+              <w:t>12</w:t>
+            </w:r>
+          </w:p>
+        </w:tc>
+        <w:tc>
+          <w:tcPr>
+            <w:tcW w:w="1036" w:type="dxa"/>
+          </w:tcPr>
+          <w:p>
+            <w:r>
+              <w:t>10.4kHz</w:t>
+            </w:r>
+          </w:p>
+        </w:tc>
+        <w:tc>
+          <w:tcPr>
+            <w:tcW w:w="1229" w:type="dxa"/>
+          </w:tcPr>
+          <w:p>
+            <w:r>
+              <w:t>951MHz</w:t>
+            </w:r>
+          </w:p>
+        </w:tc>
+        <w:tc>
+          <w:tcPr>
+            <w:tcW w:w="1826" w:type="dxa"/>
+          </w:tcPr>
+          <w:p>
+            <w:r>
+              <w:t>22dBm -</w:t>
+            </w:r>
+          </w:p>
+        </w:tc>
+        <w:tc>
+          <w:tcPr>
+            <w:tcW w:w="1530" w:type="dxa"/>
+          </w:tcPr>
+          <w:p>
+            <w:r>
+              <w:t>-133.6</w:t>
+            </w:r>
+            <w:r>
+              <w:t xml:space="preserve"> </w:t>
+            </w:r>
+            <w:r>
+              <w:t>dBm</w:t>
+            </w:r>
+          </w:p>
+        </w:tc>
+        <w:tc>
+          <w:tcPr>
+            <w:tcW w:w="1705" w:type="dxa"/>
+          </w:tcPr>
+          <w:p>
+            <w:r>
+              <w:t>-148 dBm</w:t>
+            </w:r>
+          </w:p>
+        </w:tc>
+        <w:tc>
+          <w:tcPr>
+            <w:tcW w:w="1369" w:type="dxa"/>
           </w:tcPr>
           <w:p/>
         </w:tc>
@@ -1127,37 +1226,70 @@
       <w:tr>
         <w:tc>
           <w:tcPr>
-            <w:tcW w:w="1558" w:type="dxa"/>
-          </w:tcPr>
-          <w:p/>
-        </w:tc>
-        <w:tc>
-          <w:tcPr>
-            <w:tcW w:w="1558" w:type="dxa"/>
-          </w:tcPr>
-          <w:p/>
-        </w:tc>
-        <w:tc>
-          <w:tcPr>
-            <w:tcW w:w="1558" w:type="dxa"/>
-          </w:tcPr>
-          <w:p/>
-        </w:tc>
-        <w:tc>
-          <w:tcPr>
-            <w:tcW w:w="1558" w:type="dxa"/>
-          </w:tcPr>
-          <w:p/>
-        </w:tc>
-        <w:tc>
-          <w:tcPr>
-            <w:tcW w:w="1559" w:type="dxa"/>
-          </w:tcPr>
-          <w:p/>
-        </w:tc>
-        <w:tc>
-          <w:tcPr>
-            <w:tcW w:w="1559" w:type="dxa"/>
+            <w:tcW w:w="764" w:type="dxa"/>
+          </w:tcPr>
+          <w:p>
+            <w:r>
+              <w:t>7</w:t>
+            </w:r>
+          </w:p>
+        </w:tc>
+        <w:tc>
+          <w:tcPr>
+            <w:tcW w:w="1036" w:type="dxa"/>
+          </w:tcPr>
+          <w:p>
+            <w:r>
+              <w:t>125</w:t>
+            </w:r>
+            <w:r>
+              <w:t>kHz</w:t>
+            </w:r>
+          </w:p>
+        </w:tc>
+        <w:tc>
+          <w:tcPr>
+            <w:tcW w:w="1229" w:type="dxa"/>
+          </w:tcPr>
+          <w:p>
+            <w:r>
+              <w:t>951MHz</w:t>
+            </w:r>
+          </w:p>
+        </w:tc>
+        <w:tc>
+          <w:tcPr>
+            <w:tcW w:w="1826" w:type="dxa"/>
+          </w:tcPr>
+          <w:p>
+            <w:r>
+              <w:t>22dBm -</w:t>
+            </w:r>
+          </w:p>
+        </w:tc>
+        <w:tc>
+          <w:tcPr>
+            <w:tcW w:w="1530" w:type="dxa"/>
+          </w:tcPr>
+          <w:p>
+            <w:r>
+              <w:t>-122.8 dBm</w:t>
+            </w:r>
+          </w:p>
+        </w:tc>
+        <w:tc>
+          <w:tcPr>
+            <w:tcW w:w="1705" w:type="dxa"/>
+          </w:tcPr>
+          <w:p>
+            <w:r>
+              <w:t>-124 dBm</w:t>
+            </w:r>
+          </w:p>
+        </w:tc>
+        <w:tc>
+          <w:tcPr>
+            <w:tcW w:w="1369" w:type="dxa"/>
           </w:tcPr>
           <w:p/>
         </w:tc>
@@ -1165,43 +1297,392 @@
       <w:tr>
         <w:tc>
           <w:tcPr>
-            <w:tcW w:w="1558" w:type="dxa"/>
+            <w:tcW w:w="764" w:type="dxa"/>
+          </w:tcPr>
+          <w:p>
+            <w:r>
+              <w:t>12</w:t>
+            </w:r>
+          </w:p>
+        </w:tc>
+        <w:tc>
+          <w:tcPr>
+            <w:tcW w:w="1036" w:type="dxa"/>
+          </w:tcPr>
+          <w:p>
+            <w:r>
+              <w:t>125</w:t>
+            </w:r>
+            <w:r>
+              <w:t>kHz</w:t>
+            </w:r>
+          </w:p>
+        </w:tc>
+        <w:tc>
+          <w:tcPr>
+            <w:tcW w:w="1229" w:type="dxa"/>
+          </w:tcPr>
+          <w:p>
+            <w:r>
+              <w:t>951MHz</w:t>
+            </w:r>
+          </w:p>
+        </w:tc>
+        <w:tc>
+          <w:tcPr>
+            <w:tcW w:w="1826" w:type="dxa"/>
+          </w:tcPr>
+          <w:p>
+            <w:r>
+              <w:t>22dBm -</w:t>
+            </w:r>
+          </w:p>
+        </w:tc>
+        <w:tc>
+          <w:tcPr>
+            <w:tcW w:w="1530" w:type="dxa"/>
+          </w:tcPr>
+          <w:p>
+            <w:r>
+              <w:t>-122.8</w:t>
+            </w:r>
+            <w:r>
+              <w:t xml:space="preserve"> </w:t>
+            </w:r>
+            <w:r>
+              <w:t>dBm</w:t>
+            </w:r>
+          </w:p>
+        </w:tc>
+        <w:tc>
+          <w:tcPr>
+            <w:tcW w:w="1705" w:type="dxa"/>
+          </w:tcPr>
+          <w:p>
+            <w:r>
+              <w:t>-137 dBm</w:t>
+            </w:r>
+          </w:p>
+        </w:tc>
+        <w:tc>
+          <w:tcPr>
+            <w:tcW w:w="1369" w:type="dxa"/>
           </w:tcPr>
           <w:p/>
         </w:tc>
-        <w:tc>
-          <w:tcPr>
-            <w:tcW w:w="1558" w:type="dxa"/>
+      </w:tr>
+      <w:tr>
+        <w:tc>
+          <w:tcPr>
+            <w:tcW w:w="764" w:type="dxa"/>
+          </w:tcPr>
+          <w:p>
+            <w:r>
+              <w:t>7</w:t>
+            </w:r>
+          </w:p>
+        </w:tc>
+        <w:tc>
+          <w:tcPr>
+            <w:tcW w:w="1036" w:type="dxa"/>
+          </w:tcPr>
+          <w:p>
+            <w:r>
+              <w:t>500kHz</w:t>
+            </w:r>
+          </w:p>
+        </w:tc>
+        <w:tc>
+          <w:tcPr>
+            <w:tcW w:w="1229" w:type="dxa"/>
+          </w:tcPr>
+          <w:p>
+            <w:r>
+              <w:t>951MHz</w:t>
+            </w:r>
+          </w:p>
+        </w:tc>
+        <w:tc>
+          <w:tcPr>
+            <w:tcW w:w="1826" w:type="dxa"/>
+          </w:tcPr>
+          <w:p>
+            <w:r>
+              <w:t>22dBm -</w:t>
+            </w:r>
+          </w:p>
+        </w:tc>
+        <w:tc>
+          <w:tcPr>
+            <w:tcW w:w="1530" w:type="dxa"/>
+          </w:tcPr>
+          <w:p>
+            <w:r>
+              <w:t>-116.8 dBm</w:t>
+            </w:r>
+          </w:p>
+        </w:tc>
+        <w:tc>
+          <w:tcPr>
+            <w:tcW w:w="1705" w:type="dxa"/>
+          </w:tcPr>
+          <w:p>
+            <w:r>
+              <w:t>-117 dBm</w:t>
+            </w:r>
+          </w:p>
+        </w:tc>
+        <w:tc>
+          <w:tcPr>
+            <w:tcW w:w="1369" w:type="dxa"/>
           </w:tcPr>
           <w:p/>
         </w:tc>
-        <w:tc>
-          <w:tcPr>
-            <w:tcW w:w="1558" w:type="dxa"/>
-          </w:tcPr>
-          <w:p/>
-        </w:tc>
-        <w:tc>
-          <w:tcPr>
-            <w:tcW w:w="1558" w:type="dxa"/>
-          </w:tcPr>
-          <w:p/>
-        </w:tc>
-        <w:tc>
-          <w:tcPr>
-            <w:tcW w:w="1559" w:type="dxa"/>
-          </w:tcPr>
-          <w:p/>
-        </w:tc>
-        <w:tc>
-          <w:tcPr>
-            <w:tcW w:w="1559" w:type="dxa"/>
+      </w:tr>
+      <w:tr>
+        <w:tc>
+          <w:tcPr>
+            <w:tcW w:w="764" w:type="dxa"/>
+          </w:tcPr>
+          <w:p>
+            <w:r>
+              <w:t>12</w:t>
+            </w:r>
+          </w:p>
+        </w:tc>
+        <w:tc>
+          <w:tcPr>
+            <w:tcW w:w="1036" w:type="dxa"/>
+          </w:tcPr>
+          <w:p>
+            <w:r>
+              <w:t>500kHz</w:t>
+            </w:r>
+          </w:p>
+        </w:tc>
+        <w:tc>
+          <w:tcPr>
+            <w:tcW w:w="1229" w:type="dxa"/>
+          </w:tcPr>
+          <w:p>
+            <w:r>
+              <w:t>951MHz</w:t>
+            </w:r>
+          </w:p>
+        </w:tc>
+        <w:tc>
+          <w:tcPr>
+            <w:tcW w:w="1826" w:type="dxa"/>
+          </w:tcPr>
+          <w:p>
+            <w:r>
+              <w:t>22dBm -</w:t>
+            </w:r>
+          </w:p>
+        </w:tc>
+        <w:tc>
+          <w:tcPr>
+            <w:tcW w:w="1530" w:type="dxa"/>
+          </w:tcPr>
+          <w:p>
+            <w:r>
+              <w:t>-116.8 dBm</w:t>
+            </w:r>
+          </w:p>
+        </w:tc>
+        <w:tc>
+          <w:tcPr>
+            <w:tcW w:w="1705" w:type="dxa"/>
+          </w:tcPr>
+          <w:p>
+            <w:r>
+              <w:t>-129 dBm</w:t>
+            </w:r>
+          </w:p>
+        </w:tc>
+        <w:tc>
+          <w:tcPr>
+            <w:tcW w:w="1369" w:type="dxa"/>
           </w:tcPr>
           <w:p/>
         </w:tc>
       </w:tr>
     </w:tbl>
     <w:p/>
+    <w:p>
+      <w:r>
+        <w:t>SX1262 LoRa node chip</w:t>
+      </w:r>
+    </w:p>
+    <w:p>
+      <w:r>
+        <w:t>Max Tx 22dBm</w:t>
+      </w:r>
+    </w:p>
+    <w:p>
+      <w:r>
+        <w:t>Freq range 150MHz – 960MHz</w:t>
+      </w:r>
+    </w:p>
+    <w:p>
+      <w:r>
+        <w:t>BW range</w:t>
+      </w:r>
+      <w:r>
+        <w:t xml:space="preserve"> 7.8/10.4 – 500kHz</w:t>
+      </w:r>
+    </w:p>
+    <w:p>
+      <w:r>
+        <w:t>SF (chips/</w:t>
+      </w:r>
+      <w:proofErr w:type="spellStart"/>
+      <w:r>
+        <w:t>sym</w:t>
+      </w:r>
+      <w:proofErr w:type="spellEnd"/>
+      <w:r>
+        <w:t xml:space="preserve"> = 2^SF) = 5-12</w:t>
+      </w:r>
+    </w:p>
+    <w:p>
+      <w:r>
+        <w:t>Thermal noise power level estimate</w:t>
+      </w:r>
+    </w:p>
+    <w:p>
+      <w:r>
+        <w:t xml:space="preserve">10log10(delta f) – 173.8 dBm for BW in Hz. </w:t>
+      </w:r>
+    </w:p>
+    <w:p>
+      <w:r>
+        <w:rPr>
+          <w:noProof/>
+        </w:rPr>
+        <w:lastRenderedPageBreak/>
+        <w:drawing>
+          <wp:inline distT="0" distB="0" distL="0" distR="0" wp14:anchorId="79C04FA5" wp14:editId="24E82BF5">
+            <wp:extent cx="5943600" cy="1126490"/>
+            <wp:effectExtent l="0" t="0" r="0" b="0"/>
+            <wp:docPr id="825676831" name="Picture 1"/>
+            <wp:cNvGraphicFramePr>
+              <a:graphicFrameLocks xmlns:a="http://schemas.openxmlformats.org/drawingml/2006/main" noChangeAspect="1"/>
+            </wp:cNvGraphicFramePr>
+            <a:graphic xmlns:a="http://schemas.openxmlformats.org/drawingml/2006/main">
+              <a:graphicData uri="http://schemas.openxmlformats.org/drawingml/2006/picture">
+                <pic:pic xmlns:pic="http://schemas.openxmlformats.org/drawingml/2006/picture">
+                  <pic:nvPicPr>
+                    <pic:cNvPr id="825676831" name=""/>
+                    <pic:cNvPicPr/>
+                  </pic:nvPicPr>
+                  <pic:blipFill>
+                    <a:blip r:embed="rId7"/>
+                    <a:stretch>
+                      <a:fillRect/>
+                    </a:stretch>
+                  </pic:blipFill>
+                  <pic:spPr>
+                    <a:xfrm>
+                      <a:off x="0" y="0"/>
+                      <a:ext cx="5943600" cy="1126490"/>
+                    </a:xfrm>
+                    <a:prstGeom prst="rect">
+                      <a:avLst/>
+                    </a:prstGeom>
+                  </pic:spPr>
+                </pic:pic>
+              </a:graphicData>
+            </a:graphic>
+          </wp:inline>
+        </w:drawing>
+      </w:r>
+    </w:p>
+    <w:p>
+      <w:r>
+        <w:rPr>
+          <w:noProof/>
+        </w:rPr>
+        <w:drawing>
+          <wp:inline distT="0" distB="0" distL="0" distR="0" wp14:anchorId="6E50B082" wp14:editId="02E78EB0">
+            <wp:extent cx="5943600" cy="2784475"/>
+            <wp:effectExtent l="0" t="0" r="0" b="0"/>
+            <wp:docPr id="2120923219" name="Picture 1"/>
+            <wp:cNvGraphicFramePr>
+              <a:graphicFrameLocks xmlns:a="http://schemas.openxmlformats.org/drawingml/2006/main" noChangeAspect="1"/>
+            </wp:cNvGraphicFramePr>
+            <a:graphic xmlns:a="http://schemas.openxmlformats.org/drawingml/2006/main">
+              <a:graphicData uri="http://schemas.openxmlformats.org/drawingml/2006/picture">
+                <pic:pic xmlns:pic="http://schemas.openxmlformats.org/drawingml/2006/picture">
+                  <pic:nvPicPr>
+                    <pic:cNvPr id="2120923219" name=""/>
+                    <pic:cNvPicPr/>
+                  </pic:nvPicPr>
+                  <pic:blipFill>
+                    <a:blip r:embed="rId8"/>
+                    <a:stretch>
+                      <a:fillRect/>
+                    </a:stretch>
+                  </pic:blipFill>
+                  <pic:spPr>
+                    <a:xfrm>
+                      <a:off x="0" y="0"/>
+                      <a:ext cx="5943600" cy="2784475"/>
+                    </a:xfrm>
+                    <a:prstGeom prst="rect">
+                      <a:avLst/>
+                    </a:prstGeom>
+                  </pic:spPr>
+                </pic:pic>
+              </a:graphicData>
+            </a:graphic>
+          </wp:inline>
+        </w:drawing>
+      </w:r>
+    </w:p>
+    <w:p>
+      <w:r>
+        <w:rPr>
+          <w:noProof/>
+        </w:rPr>
+        <w:lastRenderedPageBreak/>
+        <w:drawing>
+          <wp:inline distT="0" distB="0" distL="0" distR="0" wp14:anchorId="26E99541" wp14:editId="6A0FAF4F">
+            <wp:extent cx="4886325" cy="5705475"/>
+            <wp:effectExtent l="0" t="0" r="9525" b="9525"/>
+            <wp:docPr id="1106491370" name="Picture 1"/>
+            <wp:cNvGraphicFramePr>
+              <a:graphicFrameLocks xmlns:a="http://schemas.openxmlformats.org/drawingml/2006/main" noChangeAspect="1"/>
+            </wp:cNvGraphicFramePr>
+            <a:graphic xmlns:a="http://schemas.openxmlformats.org/drawingml/2006/main">
+              <a:graphicData uri="http://schemas.openxmlformats.org/drawingml/2006/picture">
+                <pic:pic xmlns:pic="http://schemas.openxmlformats.org/drawingml/2006/picture">
+                  <pic:nvPicPr>
+                    <pic:cNvPr id="1106491370" name=""/>
+                    <pic:cNvPicPr/>
+                  </pic:nvPicPr>
+                  <pic:blipFill>
+                    <a:blip r:embed="rId9"/>
+                    <a:stretch>
+                      <a:fillRect/>
+                    </a:stretch>
+                  </pic:blipFill>
+                  <pic:spPr>
+                    <a:xfrm>
+                      <a:off x="0" y="0"/>
+                      <a:ext cx="4886325" cy="5705475"/>
+                    </a:xfrm>
+                    <a:prstGeom prst="rect">
+                      <a:avLst/>
+                    </a:prstGeom>
+                  </pic:spPr>
+                </pic:pic>
+              </a:graphicData>
+            </a:graphic>
+          </wp:inline>
+        </w:drawing>
+      </w:r>
+    </w:p>
     <w:sectPr>
       <w:pgSz w:w="12240" w:h="15840"/>
       <w:pgMar w:top="1440" w:right="1440" w:bottom="1440" w:left="1440" w:header="720" w:footer="720" w:gutter="0"/>
@@ -2413,7 +2894,6 @@
   <w:style w:type="character" w:default="1" w:styleId="DefaultParagraphFont">
     <w:name w:val="Default Paragraph Font"/>
     <w:uiPriority w:val="1"/>
-    <w:semiHidden/>
     <w:unhideWhenUsed/>
   </w:style>
   <w:style w:type="table" w:default="1" w:styleId="TableNormal">

</xml_diff>

<commit_message>
Update Quantitative Evaluation of LoRa RF Resiliency.docx
</commit_message>
<xml_diff>
--- a/Quantitative Evaluation of LoRa RF Resiliency.docx
+++ b/Quantitative Evaluation of LoRa RF Resiliency.docx
@@ -955,24 +955,6 @@
     </w:p>
     <w:p>
       <w:pPr>
-        <w:rPr>
-          <w:rFonts w:eastAsiaTheme="majorEastAsia" w:cs="Times New Roman"/>
-          <w:color w:val="0F4761" w:themeColor="accent1" w:themeShade="BF"/>
-          <w:sz w:val="32"/>
-        </w:rPr>
-      </w:pPr>
-    </w:p>
-    <w:p>
-      <w:pPr>
-        <w:rPr>
-          <w:rFonts w:eastAsiaTheme="majorEastAsia" w:cs="Times New Roman"/>
-          <w:color w:val="0F4761" w:themeColor="accent1" w:themeShade="BF"/>
-          <w:sz w:val="32"/>
-        </w:rPr>
-      </w:pPr>
-    </w:p>
-    <w:p>
-      <w:pPr>
         <w:pStyle w:val="Heading1"/>
       </w:pPr>
       <w:r>
@@ -1881,12 +1863,455 @@
     </w:tbl>
     <w:p>
       <w:r>
-        <w:t>*note – need to confirm. Is this only with 125Byte payload?</w:t>
+        <w:t>*</w:t>
+      </w:r>
+      <w:proofErr w:type="gramStart"/>
+      <w:r>
+        <w:t>note</w:t>
+      </w:r>
+      <w:proofErr w:type="gramEnd"/>
+      <w:r>
+        <w:t xml:space="preserve"> – </w:t>
+      </w:r>
+      <w:r>
+        <w:t>50byte payload</w:t>
+      </w:r>
+    </w:p>
+    <w:tbl>
+      <w:tblPr>
+        <w:tblStyle w:val="TableGrid"/>
+        <w:tblW w:w="0" w:type="auto"/>
+        <w:tblLook w:val="04A0" w:firstRow="1" w:lastRow="0" w:firstColumn="1" w:lastColumn="0" w:noHBand="0" w:noVBand="1"/>
+      </w:tblPr>
+      <w:tblGrid>
+        <w:gridCol w:w="1075"/>
+        <w:gridCol w:w="1440"/>
+        <w:gridCol w:w="2250"/>
+        <w:gridCol w:w="1800"/>
+        <w:gridCol w:w="2785"/>
+      </w:tblGrid>
+      <w:tr>
+        <w:tc>
+          <w:tcPr>
+            <w:tcW w:w="1075" w:type="dxa"/>
+          </w:tcPr>
+          <w:p>
+            <w:r>
+              <w:t>SF</w:t>
+            </w:r>
+          </w:p>
+        </w:tc>
+        <w:tc>
+          <w:tcPr>
+            <w:tcW w:w="1440" w:type="dxa"/>
+          </w:tcPr>
+          <w:p>
+            <w:r>
+              <w:t>BW (kHz)</w:t>
+            </w:r>
+          </w:p>
+        </w:tc>
+        <w:tc>
+          <w:tcPr>
+            <w:tcW w:w="2250" w:type="dxa"/>
+          </w:tcPr>
+          <w:p>
+            <w:r>
+              <w:t>Sym Rate (</w:t>
+            </w:r>
+            <w:proofErr w:type="spellStart"/>
+            <w:r>
+              <w:t>sym</w:t>
+            </w:r>
+            <w:proofErr w:type="spellEnd"/>
+            <w:r>
+              <w:t>/s)</w:t>
+            </w:r>
+          </w:p>
+        </w:tc>
+        <w:tc>
+          <w:tcPr>
+            <w:tcW w:w="1800" w:type="dxa"/>
+          </w:tcPr>
+          <w:p>
+            <w:r>
+              <w:t>Time on Air (s)</w:t>
+            </w:r>
+          </w:p>
+        </w:tc>
+        <w:tc>
+          <w:tcPr>
+            <w:tcW w:w="2785" w:type="dxa"/>
+          </w:tcPr>
+          <w:p>
+            <w:r>
+              <w:t>LISTEN_WINDOW (</w:t>
+            </w:r>
+            <w:proofErr w:type="spellStart"/>
+            <w:r>
+              <w:t>ms</w:t>
+            </w:r>
+            <w:proofErr w:type="spellEnd"/>
+            <w:r>
+              <w:t>)</w:t>
+            </w:r>
+          </w:p>
+        </w:tc>
+      </w:tr>
+      <w:tr>
+        <w:tc>
+          <w:tcPr>
+            <w:tcW w:w="1075" w:type="dxa"/>
+          </w:tcPr>
+          <w:p>
+            <w:r>
+              <w:t>7</w:t>
+            </w:r>
+          </w:p>
+        </w:tc>
+        <w:tc>
+          <w:tcPr>
+            <w:tcW w:w="1440" w:type="dxa"/>
+          </w:tcPr>
+          <w:p>
+            <w:r>
+              <w:t>10.4</w:t>
+            </w:r>
+          </w:p>
+        </w:tc>
+        <w:tc>
+          <w:tcPr>
+            <w:tcW w:w="2250" w:type="dxa"/>
+          </w:tcPr>
+          <w:p>
+            <w:r>
+              <w:t>81.25</w:t>
+            </w:r>
+          </w:p>
+        </w:tc>
+        <w:tc>
+          <w:tcPr>
+            <w:tcW w:w="1800" w:type="dxa"/>
+          </w:tcPr>
+          <w:p>
+            <w:r>
+              <w:t>2.5</w:t>
+            </w:r>
+          </w:p>
+        </w:tc>
+        <w:tc>
+          <w:tcPr>
+            <w:tcW w:w="2785" w:type="dxa"/>
+          </w:tcPr>
+          <w:p>
+            <w:r>
+              <w:t>5</w:t>
+            </w:r>
+            <w:r>
+              <w:t>000</w:t>
+            </w:r>
+          </w:p>
+        </w:tc>
+      </w:tr>
+      <w:tr>
+        <w:tc>
+          <w:tcPr>
+            <w:tcW w:w="1075" w:type="dxa"/>
+          </w:tcPr>
+          <w:p>
+            <w:r>
+              <w:t>7</w:t>
+            </w:r>
+          </w:p>
+        </w:tc>
+        <w:tc>
+          <w:tcPr>
+            <w:tcW w:w="1440" w:type="dxa"/>
+          </w:tcPr>
+          <w:p>
+            <w:r>
+              <w:t>125</w:t>
+            </w:r>
+          </w:p>
+        </w:tc>
+        <w:tc>
+          <w:tcPr>
+            <w:tcW w:w="2250" w:type="dxa"/>
+          </w:tcPr>
+          <w:p>
+            <w:r>
+              <w:t>976.56</w:t>
+            </w:r>
+          </w:p>
+        </w:tc>
+        <w:tc>
+          <w:tcPr>
+            <w:tcW w:w="1800" w:type="dxa"/>
+          </w:tcPr>
+          <w:p>
+            <w:r>
+              <w:t>0.</w:t>
+            </w:r>
+            <w:r>
+              <w:t>21</w:t>
+            </w:r>
+          </w:p>
+        </w:tc>
+        <w:tc>
+          <w:tcPr>
+            <w:tcW w:w="2785" w:type="dxa"/>
+          </w:tcPr>
+          <w:p>
+            <w:r>
+              <w:t>500</w:t>
+            </w:r>
+          </w:p>
+        </w:tc>
+      </w:tr>
+      <w:tr>
+        <w:tc>
+          <w:tcPr>
+            <w:tcW w:w="1075" w:type="dxa"/>
+          </w:tcPr>
+          <w:p>
+            <w:r>
+              <w:t>7</w:t>
+            </w:r>
+          </w:p>
+        </w:tc>
+        <w:tc>
+          <w:tcPr>
+            <w:tcW w:w="1440" w:type="dxa"/>
+          </w:tcPr>
+          <w:p>
+            <w:r>
+              <w:t>500</w:t>
+            </w:r>
+          </w:p>
+        </w:tc>
+        <w:tc>
+          <w:tcPr>
+            <w:tcW w:w="2250" w:type="dxa"/>
+          </w:tcPr>
+          <w:p>
+            <w:r>
+              <w:t>3906.25</w:t>
+            </w:r>
+          </w:p>
+        </w:tc>
+        <w:tc>
+          <w:tcPr>
+            <w:tcW w:w="1800" w:type="dxa"/>
+          </w:tcPr>
+          <w:p>
+            <w:r>
+              <w:t>0.0</w:t>
+            </w:r>
+            <w:r>
+              <w:t>5</w:t>
+            </w:r>
+          </w:p>
+        </w:tc>
+        <w:tc>
+          <w:tcPr>
+            <w:tcW w:w="2785" w:type="dxa"/>
+          </w:tcPr>
+          <w:p>
+            <w:r>
+              <w:t>250</w:t>
+            </w:r>
+          </w:p>
+        </w:tc>
+      </w:tr>
+      <w:tr>
+        <w:tc>
+          <w:tcPr>
+            <w:tcW w:w="1075" w:type="dxa"/>
+          </w:tcPr>
+          <w:p>
+            <w:r>
+              <w:t>12</w:t>
+            </w:r>
+          </w:p>
+        </w:tc>
+        <w:tc>
+          <w:tcPr>
+            <w:tcW w:w="1440" w:type="dxa"/>
+          </w:tcPr>
+          <w:p>
+            <w:r>
+              <w:t>10.4</w:t>
+            </w:r>
+          </w:p>
+        </w:tc>
+        <w:tc>
+          <w:tcPr>
+            <w:tcW w:w="2250" w:type="dxa"/>
+          </w:tcPr>
+          <w:p>
+            <w:r>
+              <w:t>2.54</w:t>
+            </w:r>
+          </w:p>
+        </w:tc>
+        <w:tc>
+          <w:tcPr>
+            <w:tcW w:w="1800" w:type="dxa"/>
+          </w:tcPr>
+          <w:p>
+            <w:r>
+              <w:t>98</w:t>
+            </w:r>
+          </w:p>
+        </w:tc>
+        <w:tc>
+          <w:tcPr>
+            <w:tcW w:w="2785" w:type="dxa"/>
+          </w:tcPr>
+          <w:p>
+            <w:r>
+              <w:t>150</w:t>
+            </w:r>
+            <w:r>
+              <w:t>000</w:t>
+            </w:r>
+          </w:p>
+        </w:tc>
+      </w:tr>
+      <w:tr>
+        <w:tc>
+          <w:tcPr>
+            <w:tcW w:w="1075" w:type="dxa"/>
+          </w:tcPr>
+          <w:p>
+            <w:r>
+              <w:t>12</w:t>
+            </w:r>
+          </w:p>
+        </w:tc>
+        <w:tc>
+          <w:tcPr>
+            <w:tcW w:w="1440" w:type="dxa"/>
+          </w:tcPr>
+          <w:p>
+            <w:r>
+              <w:t>125</w:t>
+            </w:r>
+          </w:p>
+        </w:tc>
+        <w:tc>
+          <w:tcPr>
+            <w:tcW w:w="2250" w:type="dxa"/>
+          </w:tcPr>
+          <w:p>
+            <w:r>
+              <w:t>30.52</w:t>
+            </w:r>
+          </w:p>
+        </w:tc>
+        <w:tc>
+          <w:tcPr>
+            <w:tcW w:w="1800" w:type="dxa"/>
+          </w:tcPr>
+          <w:p>
+            <w:r>
+              <w:t>8.2</w:t>
+            </w:r>
+          </w:p>
+        </w:tc>
+        <w:tc>
+          <w:tcPr>
+            <w:tcW w:w="2785" w:type="dxa"/>
+          </w:tcPr>
+          <w:p>
+            <w:r>
+              <w:t>15</w:t>
+            </w:r>
+            <w:r>
+              <w:t>000</w:t>
+            </w:r>
+          </w:p>
+        </w:tc>
+      </w:tr>
+      <w:tr>
+        <w:tc>
+          <w:tcPr>
+            <w:tcW w:w="1075" w:type="dxa"/>
+          </w:tcPr>
+          <w:p>
+            <w:r>
+              <w:t>12</w:t>
+            </w:r>
+          </w:p>
+        </w:tc>
+        <w:tc>
+          <w:tcPr>
+            <w:tcW w:w="1440" w:type="dxa"/>
+          </w:tcPr>
+          <w:p>
+            <w:r>
+              <w:t>500</w:t>
+            </w:r>
+          </w:p>
+        </w:tc>
+        <w:tc>
+          <w:tcPr>
+            <w:tcW w:w="2250" w:type="dxa"/>
+          </w:tcPr>
+          <w:p>
+            <w:r>
+              <w:t>122.07</w:t>
+            </w:r>
+          </w:p>
+        </w:tc>
+        <w:tc>
+          <w:tcPr>
+            <w:tcW w:w="1800" w:type="dxa"/>
+          </w:tcPr>
+          <w:p>
+            <w:r>
+              <w:t>2</w:t>
+            </w:r>
+          </w:p>
+        </w:tc>
+        <w:tc>
+          <w:tcPr>
+            <w:tcW w:w="2785" w:type="dxa"/>
+          </w:tcPr>
+          <w:p>
+            <w:r>
+              <w:t>50</w:t>
+            </w:r>
+            <w:r>
+              <w:t>00</w:t>
+            </w:r>
+          </w:p>
+        </w:tc>
+      </w:tr>
+    </w:tbl>
+    <w:p>
+      <w:r>
+        <w:t>*</w:t>
+      </w:r>
+      <w:proofErr w:type="gramStart"/>
+      <w:r>
+        <w:t>note</w:t>
+      </w:r>
+      <w:proofErr w:type="gramEnd"/>
+      <w:r>
+        <w:t xml:space="preserve"> – </w:t>
+      </w:r>
+      <w:r>
+        <w:t>12</w:t>
+      </w:r>
+      <w:r>
+        <w:t>5byte payload</w:t>
       </w:r>
     </w:p>
     <w:p/>
     <w:p>
       <w:r>
+        <w:lastRenderedPageBreak/>
         <w:t>SX1262 LoRa node chip</w:t>
       </w:r>
     </w:p>
@@ -1902,7 +2327,6 @@
     </w:p>
     <w:p>
       <w:r>
-        <w:lastRenderedPageBreak/>
         <w:t>BW range</w:t>
       </w:r>
       <w:r>

</xml_diff>